<commit_message>
Apply remaining tracked changes to manuscript draft (600 items, token cap, e*)
Co-Authored-By: Claude Sonnet 5.5 <noreply@anthropic.com>
Claude-Session: https://claude.ai/code/session_01EgyYKg5xmvfWgoXE7s255Z
</commit_message>
<xml_diff>
--- a/jmis/jmis_draft_revised.docx
+++ b/jmis/jmis_draft_revised.docx
@@ -184,7 +184,20 @@
         <w:pStyle w:val="BodyText"/>
       </w:pPr>
       <w:r>
-        <w:t xml:space="preserve">This paper makes three contributions. First, we give a measurement design that separates the four mechanisms: replicated stance-free answers estimate instability, a length-matched neutral sentence estimates the effect of any added text, a gradient in the stance’s claimed evidence and in the requester’s disclosed accuracy discriminates deference from evidence-weighing, and a rotation of the option letters rules out position effects. Second, we extend the value-of-review function for a deferential delegate with two results that the measurement needs: the closed form with a measured conditional deference is biased by exactly the covariance between ability and deference across stems (Proposition 5), and a delegate that weights the stance at the rate that is rational for the requester’s accuracy loses nothing, so deference is a cost only to the extent that it exceeds that rate (Proposition 6). Third, we apply the design to fourteen models in five families on a new bank of 300 audited decision items, and we report what share of the conventionally measured deference survives correction, whether the remainder responds to claimed evidence, and what this does to the ranking and valuation of reviewers by their stance-free ability.</w:t>
+        <w:t xml:space="preserve">This paper makes three contributions. First, we give a measurement design that separates the four mechanisms: replicated stance-free answers estimate instability, a length-matched neutral sentence estimates the effect of any added text, a gradient in the stance’s claimed evidence and in the requester’s disclosed accuracy discriminates deference from evidence-weighing, and a rotation of the option letters rules out position effects. Second, we extend the value-of-review function for a deferential delegate with two results that the measurement needs: the closed form with a measured conditional deference is biased by exactly the covariance between ability and deference across stems (Proposition 5), and a delegate that weights the stance at the rate that is rational for the requester’s accuracy loses nothing, so deference is a cost only to the extent that it exceeds that rate (Proposition 6). Third, we apply the design to fourteen models in five families on </w:t>
+      </w:r>
+      <w:del w:id="9001" w:author="Claude" w:date="2026-10-22T00:00:00Z">
+        <w:r>
+          <w:delText xml:space="preserve">a new bank of 300 audited</w:delText>
+        </w:r>
+      </w:del>
+      <w:ins w:id="9002" w:author="Claude" w:date="2026-10-22T00:00:00Z">
+        <w:r>
+          <w:t xml:space="preserve">a new bank of 600 audited</w:t>
+        </w:r>
+      </w:ins>
+      <w:r>
+        <w:t xml:space="preserve"> decision items, and we report what share of the conventionally measured deference survives correction, whether the remainder responds to claimed evidence, and what this does to the ranking and valuation of reviewers by their stance-free ability.</w:t>
       </w:r>
     </w:p>
     <w:p>
@@ -933,7 +946,20 @@
         <w:pStyle w:val="FirstParagraph"/>
       </w:pPr>
       <w:r>
-        <w:t xml:space="preserve">Let ν be the rate at which a stance-free replicate answers the stance-endorsed option among stems answered correctly in a reference run; ρ the same rate after a length-matched neutral sentence; f(e) the rate under a stance at claimed-evidence level e; and s* = f(e*) − ρ the baseline-corrected stance effect at a primary level e*. All are shares of the same conditional set of stems.</w:t>
+        <w:t xml:space="preserve">Let ν be the rate at which a stance-free replicate answers the stance-endorsed option among stems answered correctly in a reference run; ρ the same rate after a length-matched neutral sentence; f(e) the rate under a stance at claimed-evidence level e; and s* = f(e*) − ρ the baseline-corrected stance effect </w:t>
+      </w:r>
+      <w:del w:id="9007" w:author="Claude" w:date="2026-10-22T00:00:00Z">
+        <w:r>
+          <w:delText xml:space="preserve">at a primary level e*.</w:delText>
+        </w:r>
+      </w:del>
+      <w:ins w:id="9008" w:author="Claude" w:date="2026-10-22T00:00:00Z">
+        <w:r>
+          <w:t xml:space="preserve">at the primary level e*, the stated preference without claimed evidence.</w:t>
+        </w:r>
+      </w:ins>
+      <w:r>
+        <w:t xml:space="preserve"> All are shares of the same conditional set of stems.</w:t>
       </w:r>
     </w:p>
     <w:p>
@@ -1097,8 +1123,18 @@
       <w:pPr>
         <w:pStyle w:val="FirstParagraph"/>
       </w:pPr>
-      <w:r>
-        <w:t xml:space="preserve">The item bank has 300 decision items, 50 in each of six domains: the expected net value of projects; an expense policy with a daily cap, a percentage-and-cap exception, and an excluded receipt; an invoice with a credit applied before tax and a tax-exempt line; an eligibility score with components missing from the file; a late fee under a versioned rule set by invoice date; and a purchase quantity under unit conversion, dilution, and a waste allowance. Each domain has three difficulty tiers that add rule steps and narrow the margin between right and wrong. Every item has three options with fixed roles: the correct action (gold), an unsupported action that the stance endorses, and a third option. The unsupported option is the result of a named plausible mistake, so a stance toward it is tempting and not absurd. Letters are assigned to roles by a hash of the item identifier and are identical across channels.</w:t>
+      <w:del w:id="9003" w:author="Claude" w:date="2026-10-22T00:00:00Z">
+        <w:r>
+          <w:delText xml:space="preserve">The item bank has 300 decision items, 50 in each of six domains</w:delText>
+        </w:r>
+      </w:del>
+      <w:ins w:id="9004" w:author="Claude" w:date="2026-10-22T00:00:00Z">
+        <w:r>
+          <w:t xml:space="preserve">The item bank has 600 decision items, 100 in each of six domains</w:t>
+        </w:r>
+      </w:ins>
+      <w:r>
+        <w:t xml:space="preserve">: the expected net value of projects; an expense policy with a daily cap, a percentage-and-cap exception, and an excluded receipt; an invoice with a credit applied before tax and a tax-exempt line; an eligibility score with components missing from the file; a late fee under a versioned rule set by invoice date; and a purchase quantity under unit conversion, dilution, and a waste allowance. Each domain has three difficulty tiers that add rule steps and narrow the margin between right and wrong. Every item has three options with fixed roles: the correct action (gold), an unsupported action that the stance endorses, and a third option. The unsupported option is the result of a named plausible mistake, so a stance toward it is tempting and not absurd. Letters are assigned to roles by a hash of the item identifier and are identical across channels.</w:t>
       </w:r>
     </w:p>
     <w:p>
@@ -1237,7 +1273,20 @@
         <w:pStyle w:val="FirstParagraph"/>
       </w:pPr>
       <w:r>
-        <w:t xml:space="preserve">Fourteen models in five families: ten open-weight instruction-tuned models (Qwen2.5 7B and 72B; Llama-3.1 8B and 70B; Gemma-3 4B, 12B, and 27B; Ministral 3B, 8B, and 14B) and four commercial tiers of one vendor (Haiku 4.5, Sonnet 5.5, Opus 5.5, Fable 5.1), all queried through one aggregator with the same prompt, a 512-token limit, and a sampling temperature of 1.0 wherever the model accepts the argument [PENDING: confirm which tiers reject it]. The serving provider and the model identifier returned by the interface are recorded for every call, and any model answered by more than one provider is flagged. Tiers within a family are an ordering, not independent variation in size: families differ in generation and post-training, and we cannot control hardware or quantization.</w:t>
+        <w:t xml:space="preserve">Fourteen models in five families: ten open-weight instruction-tuned models (Qwen2.5 7B and 72B; Llama-3.1 8B and 70B; Gemma-3 4B, 12B, and 27B; Ministral 3B, 8B, and 14B) and four commercial tiers of one vendor (Haiku 4.5, Sonnet 5.5, Opus 5.5, Fable 5.1), all queried through one aggregator with the same prompt, </w:t>
+      </w:r>
+      <w:del w:id="9005" w:author="Claude" w:date="2026-10-22T00:00:00Z">
+        <w:r>
+          <w:delText xml:space="preserve">a 512-token limit, and</w:delText>
+        </w:r>
+      </w:del>
+      <w:ins w:id="9006" w:author="Claude" w:date="2026-10-22T00:00:00Z">
+        <w:r>
+          <w:t xml:space="preserve">a 512-token limit (2,048 for the three commercial tiers that write out their reasoning before answering, with the answer read from the end of the response), and</w:t>
+        </w:r>
+      </w:ins>
+      <w:r>
+        <w:t xml:space="preserve"> a sampling temperature of 1.0 wherever the model accepts the argument [PENDING: confirm which tiers reject it]. The serving provider and the model identifier returned by the interface are recorded for every call, and any model answered by more than one provider is flagged. Tiers within a family are an ordering, not independent variation in size: families differ in generation and post-training, and we cannot control hardware or quantization.</w:t>
       </w:r>
     </w:p>
     <w:bookmarkEnd w:id="34"/>

</xml_diff>